<commit_message>
Præciser Nyt spil efter afsluttet spil
</commit_message>
<xml_diff>
--- a/Yatzy-SDD.docx
+++ b/Yatzy-SDD.docx
@@ -60,12 +60,6 @@
         <w:gridCol w:w="4706"/>
       </w:tblGrid>
       <w:tr>
-        <w:tblPrEx>
-          <w:tblCellMar>
-            <w:top w:w="0" w:type="dxa"/>
-            <w:bottom w:w="0" w:type="dxa"/>
-          </w:tblCellMar>
-        </w:tblPrEx>
         <w:tc>
           <w:tcPr>
             <w:tcW w:w="4706" w:type="dxa"/>
@@ -114,12 +108,6 @@
         </w:tc>
       </w:tr>
       <w:tr>
-        <w:tblPrEx>
-          <w:tblCellMar>
-            <w:top w:w="0" w:type="dxa"/>
-            <w:bottom w:w="0" w:type="dxa"/>
-          </w:tblCellMar>
-        </w:tblPrEx>
         <w:tc>
           <w:tcPr>
             <w:tcW w:w="4706" w:type="dxa"/>
@@ -164,12 +152,6 @@
         </w:tc>
       </w:tr>
       <w:tr>
-        <w:tblPrEx>
-          <w:tblCellMar>
-            <w:top w:w="0" w:type="dxa"/>
-            <w:bottom w:w="0" w:type="dxa"/>
-          </w:tblCellMar>
-        </w:tblPrEx>
         <w:tc>
           <w:tcPr>
             <w:tcW w:w="4706" w:type="dxa"/>
@@ -214,12 +196,6 @@
         </w:tc>
       </w:tr>
       <w:tr>
-        <w:tblPrEx>
-          <w:tblCellMar>
-            <w:top w:w="0" w:type="dxa"/>
-            <w:bottom w:w="0" w:type="dxa"/>
-          </w:tblCellMar>
-        </w:tblPrEx>
         <w:tc>
           <w:tcPr>
             <w:tcW w:w="4706" w:type="dxa"/>
@@ -264,12 +240,6 @@
         </w:tc>
       </w:tr>
       <w:tr>
-        <w:tblPrEx>
-          <w:tblCellMar>
-            <w:top w:w="0" w:type="dxa"/>
-            <w:bottom w:w="0" w:type="dxa"/>
-          </w:tblCellMar>
-        </w:tblPrEx>
         <w:tc>
           <w:tcPr>
             <w:tcW w:w="4706" w:type="dxa"/>
@@ -551,12 +521,6 @@
         <w:gridCol w:w="4706"/>
       </w:tblGrid>
       <w:tr>
-        <w:tblPrEx>
-          <w:tblCellMar>
-            <w:top w:w="0" w:type="dxa"/>
-            <w:bottom w:w="0" w:type="dxa"/>
-          </w:tblCellMar>
-        </w:tblPrEx>
         <w:tc>
           <w:tcPr>
             <w:tcW w:w="4706" w:type="dxa"/>
@@ -605,12 +569,6 @@
         </w:tc>
       </w:tr>
       <w:tr>
-        <w:tblPrEx>
-          <w:tblCellMar>
-            <w:top w:w="0" w:type="dxa"/>
-            <w:bottom w:w="0" w:type="dxa"/>
-          </w:tblCellMar>
-        </w:tblPrEx>
         <w:tc>
           <w:tcPr>
             <w:tcW w:w="4706" w:type="dxa"/>
@@ -655,12 +613,6 @@
         </w:tc>
       </w:tr>
       <w:tr>
-        <w:tblPrEx>
-          <w:tblCellMar>
-            <w:top w:w="0" w:type="dxa"/>
-            <w:bottom w:w="0" w:type="dxa"/>
-          </w:tblCellMar>
-        </w:tblPrEx>
         <w:tc>
           <w:tcPr>
             <w:tcW w:w="4706" w:type="dxa"/>
@@ -705,12 +657,6 @@
         </w:tc>
       </w:tr>
       <w:tr>
-        <w:tblPrEx>
-          <w:tblCellMar>
-            <w:top w:w="0" w:type="dxa"/>
-            <w:bottom w:w="0" w:type="dxa"/>
-          </w:tblCellMar>
-        </w:tblPrEx>
         <w:tc>
           <w:tcPr>
             <w:tcW w:w="4706" w:type="dxa"/>
@@ -755,12 +701,6 @@
         </w:tc>
       </w:tr>
       <w:tr>
-        <w:tblPrEx>
-          <w:tblCellMar>
-            <w:top w:w="0" w:type="dxa"/>
-            <w:bottom w:w="0" w:type="dxa"/>
-          </w:tblCellMar>
-        </w:tblPrEx>
         <w:tc>
           <w:tcPr>
             <w:tcW w:w="4706" w:type="dxa"/>
@@ -805,12 +745,6 @@
         </w:tc>
       </w:tr>
       <w:tr>
-        <w:tblPrEx>
-          <w:tblCellMar>
-            <w:top w:w="0" w:type="dxa"/>
-            <w:bottom w:w="0" w:type="dxa"/>
-          </w:tblCellMar>
-        </w:tblPrEx>
         <w:tc>
           <w:tcPr>
             <w:tcW w:w="4706" w:type="dxa"/>
@@ -855,29 +789,24 @@
         </w:tc>
       </w:tr>
       <w:tr>
-        <w:tblPrEx>
-          <w:tblCellMar>
-            <w:top w:w="0" w:type="dxa"/>
-            <w:bottom w:w="0" w:type="dxa"/>
-          </w:tblCellMar>
-        </w:tblPrEx>
-        <w:tc>
-          <w:tcPr>
-            <w:tcW w:w="4706" w:type="dxa"/>
-            <w:shd w:val="clear" w:color="auto" w:fill="auto"/>
-          </w:tcPr>
-          <w:p>
-            <w:pPr>
-              <w:rPr>
-                <w:rFonts w:ascii="Aptos" w:hAnsi="Aptos"/>
-                <w:sz w:val="19"/>
-              </w:rPr>
-            </w:pPr>
-            <w:r>
-              <w:rPr>
-                <w:rFonts w:ascii="Aptos" w:hAnsi="Aptos"/>
-                <w:sz w:val="19"/>
-              </w:rPr>
+        <w:tc>
+          <w:tcPr>
+            <w:tcW w:w="4706" w:type="dxa"/>
+            <w:shd w:val="clear" w:color="auto" w:fill="auto"/>
+          </w:tcPr>
+          <w:p>
+            <w:pPr>
+              <w:rPr>
+                <w:rFonts w:ascii="Aptos" w:hAnsi="Aptos"/>
+                <w:sz w:val="19"/>
+              </w:rPr>
+            </w:pPr>
+            <w:r>
+              <w:rPr>
+                <w:rFonts w:ascii="Aptos" w:hAnsi="Aptos"/>
+                <w:sz w:val="19"/>
+              </w:rPr>
+              <w:lastRenderedPageBreak/>
               <w:t>Stabil tilstand</w:t>
             </w:r>
           </w:p>
@@ -1189,12 +1118,6 @@
         <w:gridCol w:w="4706"/>
       </w:tblGrid>
       <w:tr>
-        <w:tblPrEx>
-          <w:tblCellMar>
-            <w:top w:w="0" w:type="dxa"/>
-            <w:bottom w:w="0" w:type="dxa"/>
-          </w:tblCellMar>
-        </w:tblPrEx>
         <w:tc>
           <w:tcPr>
             <w:tcW w:w="4706" w:type="dxa"/>
@@ -1243,12 +1166,6 @@
         </w:tc>
       </w:tr>
       <w:tr>
-        <w:tblPrEx>
-          <w:tblCellMar>
-            <w:top w:w="0" w:type="dxa"/>
-            <w:bottom w:w="0" w:type="dxa"/>
-          </w:tblCellMar>
-        </w:tblPrEx>
         <w:tc>
           <w:tcPr>
             <w:tcW w:w="4706" w:type="dxa"/>
@@ -1293,12 +1210,6 @@
         </w:tc>
       </w:tr>
       <w:tr>
-        <w:tblPrEx>
-          <w:tblCellMar>
-            <w:top w:w="0" w:type="dxa"/>
-            <w:bottom w:w="0" w:type="dxa"/>
-          </w:tblCellMar>
-        </w:tblPrEx>
         <w:tc>
           <w:tcPr>
             <w:tcW w:w="4706" w:type="dxa"/>
@@ -1343,12 +1254,6 @@
         </w:tc>
       </w:tr>
       <w:tr>
-        <w:tblPrEx>
-          <w:tblCellMar>
-            <w:top w:w="0" w:type="dxa"/>
-            <w:bottom w:w="0" w:type="dxa"/>
-          </w:tblCellMar>
-        </w:tblPrEx>
         <w:tc>
           <w:tcPr>
             <w:tcW w:w="4706" w:type="dxa"/>
@@ -1393,12 +1298,6 @@
         </w:tc>
       </w:tr>
       <w:tr>
-        <w:tblPrEx>
-          <w:tblCellMar>
-            <w:top w:w="0" w:type="dxa"/>
-            <w:bottom w:w="0" w:type="dxa"/>
-          </w:tblCellMar>
-        </w:tblPrEx>
         <w:tc>
           <w:tcPr>
             <w:tcW w:w="4706" w:type="dxa"/>
@@ -1443,12 +1342,6 @@
         </w:tc>
       </w:tr>
       <w:tr>
-        <w:tblPrEx>
-          <w:tblCellMar>
-            <w:top w:w="0" w:type="dxa"/>
-            <w:bottom w:w="0" w:type="dxa"/>
-          </w:tblCellMar>
-        </w:tblPrEx>
         <w:tc>
           <w:tcPr>
             <w:tcW w:w="4706" w:type="dxa"/>
@@ -1493,29 +1386,24 @@
         </w:tc>
       </w:tr>
       <w:tr>
-        <w:tblPrEx>
-          <w:tblCellMar>
-            <w:top w:w="0" w:type="dxa"/>
-            <w:bottom w:w="0" w:type="dxa"/>
-          </w:tblCellMar>
-        </w:tblPrEx>
-        <w:tc>
-          <w:tcPr>
-            <w:tcW w:w="4706" w:type="dxa"/>
-            <w:shd w:val="clear" w:color="auto" w:fill="auto"/>
-          </w:tcPr>
-          <w:p>
-            <w:pPr>
-              <w:rPr>
-                <w:rFonts w:ascii="Aptos" w:hAnsi="Aptos"/>
-                <w:sz w:val="19"/>
-              </w:rPr>
-            </w:pPr>
-            <w:r>
-              <w:rPr>
-                <w:rFonts w:ascii="Aptos" w:hAnsi="Aptos"/>
-                <w:sz w:val="19"/>
-              </w:rPr>
+        <w:tc>
+          <w:tcPr>
+            <w:tcW w:w="4706" w:type="dxa"/>
+            <w:shd w:val="clear" w:color="auto" w:fill="auto"/>
+          </w:tcPr>
+          <w:p>
+            <w:pPr>
+              <w:rPr>
+                <w:rFonts w:ascii="Aptos" w:hAnsi="Aptos"/>
+                <w:sz w:val="19"/>
+              </w:rPr>
+            </w:pPr>
+            <w:r>
+              <w:rPr>
+                <w:rFonts w:ascii="Aptos" w:hAnsi="Aptos"/>
+                <w:sz w:val="19"/>
+              </w:rPr>
+              <w:lastRenderedPageBreak/>
               <w:t>Fuldt hus</w:t>
             </w:r>
           </w:p>
@@ -1543,12 +1431,6 @@
         </w:tc>
       </w:tr>
       <w:tr>
-        <w:tblPrEx>
-          <w:tblCellMar>
-            <w:top w:w="0" w:type="dxa"/>
-            <w:bottom w:w="0" w:type="dxa"/>
-          </w:tblCellMar>
-        </w:tblPrEx>
         <w:tc>
           <w:tcPr>
             <w:tcW w:w="4706" w:type="dxa"/>
@@ -1593,12 +1475,6 @@
         </w:tc>
       </w:tr>
       <w:tr>
-        <w:tblPrEx>
-          <w:tblCellMar>
-            <w:top w:w="0" w:type="dxa"/>
-            <w:bottom w:w="0" w:type="dxa"/>
-          </w:tblCellMar>
-        </w:tblPrEx>
         <w:tc>
           <w:tcPr>
             <w:tcW w:w="4706" w:type="dxa"/>
@@ -2046,23 +1922,21 @@
           <w:rFonts w:ascii="Aptos" w:hAnsi="Aptos"/>
           <w:sz w:val="21"/>
         </w:rPr>
-        <w:t>• Ved afslutning vises en slutskærm med alle spillere sorteret efter samlet score, tydeligt markerede vindere og den komplette pointtavle for alle spillere. “Nyt spil” er altid tilgængeligt. Ved klik vises dialogen “Er du sikker på, at du vil afbryde spillet og starte et nyt?”. Først ved bekræftelse afbrydes en eventuel animation eller computerhandling, den gamle gemte spiltilstand slettes, og der vendes tilbage til startvinduet; ellers fortsætter det igangværende spil uændret.</w:t>
-      </w:r>
-    </w:p>
-    <w:p>
-      <w:pPr>
-        <w:spacing w:after="40"/>
-        <w:rPr>
-          <w:rFonts w:ascii="Aptos" w:hAnsi="Aptos"/>
-          <w:sz w:val="21"/>
-        </w:rPr>
-      </w:pPr>
-      <w:r>
-        <w:rPr>
-          <w:rFonts w:ascii="Aptos" w:hAnsi="Aptos"/>
-          <w:sz w:val="21"/>
-        </w:rPr>
-        <w:t>• Hvis brugeren lukker programvinduet, mens et spil er i gang, vises dialogen “Er du sikker på, at du vil afslutte? Det igangværende spil gemmes og kan fortsættes senere.” Ved Nej forbliver programmet åbent.</w:t>
+        <w:t>• Ved afslutning vises en slutskærm med alle spillere sorteret ef</w:t>
+      </w:r>
+      <w:r>
+        <w:rPr>
+          <w:rFonts w:ascii="Aptos" w:hAnsi="Aptos"/>
+          <w:sz w:val="21"/>
+        </w:rPr>
+        <w:t>Ved afslutning vises en slutskærm med alle spillere sorteret efter samlet score, tydeligt markerede vindere og den komplette pointtavle for alle spillere. “Nyt spil” er altid tilgængeligt. Mens et spil er i gang, vises ved klik dialogen “Er du sikker på, at du vil afbryde spillet og starte et nyt?”. Først ved bekræftelse afbrydes en eventuel animation eller computerhandling, den gamle gemte spiltilstand slettes, og der vendes tilbage til startvinduet; ellers fortsætter det igangværende spil uændret. Efter et afsluttet spil åbner “Nyt spil” startvinduet direkte uden en bekræftelsesdialog.</w:t>
+      </w:r>
+      <w:r>
+        <w:rPr>
+          <w:rFonts w:ascii="Aptos" w:hAnsi="Aptos"/>
+          <w:sz w:val="21"/>
+        </w:rPr>
+        <w:t xml:space="preserve"> vises dialogen “Er du sikker på, at du vil afslutte? Det igangværende spil gemmes og kan fortsættes senere.” Ved Nej forbliver programmet åbent.</w:t>
       </w:r>
     </w:p>
     <w:p>
@@ -2379,12 +2253,6 @@
         <w:gridCol w:w="4706"/>
       </w:tblGrid>
       <w:tr>
-        <w:tblPrEx>
-          <w:tblCellMar>
-            <w:top w:w="0" w:type="dxa"/>
-            <w:bottom w:w="0" w:type="dxa"/>
-          </w:tblCellMar>
-        </w:tblPrEx>
         <w:tc>
           <w:tcPr>
             <w:tcW w:w="4706" w:type="dxa"/>
@@ -2433,12 +2301,6 @@
         </w:tc>
       </w:tr>
       <w:tr>
-        <w:tblPrEx>
-          <w:tblCellMar>
-            <w:top w:w="0" w:type="dxa"/>
-            <w:bottom w:w="0" w:type="dxa"/>
-          </w:tblCellMar>
-        </w:tblPrEx>
         <w:tc>
           <w:tcPr>
             <w:tcW w:w="4706" w:type="dxa"/>
@@ -2483,12 +2345,6 @@
         </w:tc>
       </w:tr>
       <w:tr>
-        <w:tblPrEx>
-          <w:tblCellMar>
-            <w:top w:w="0" w:type="dxa"/>
-            <w:bottom w:w="0" w:type="dxa"/>
-          </w:tblCellMar>
-        </w:tblPrEx>
         <w:tc>
           <w:tcPr>
             <w:tcW w:w="4706" w:type="dxa"/>
@@ -2533,12 +2389,6 @@
         </w:tc>
       </w:tr>
       <w:tr>
-        <w:tblPrEx>
-          <w:tblCellMar>
-            <w:top w:w="0" w:type="dxa"/>
-            <w:bottom w:w="0" w:type="dxa"/>
-          </w:tblCellMar>
-        </w:tblPrEx>
         <w:tc>
           <w:tcPr>
             <w:tcW w:w="4706" w:type="dxa"/>
@@ -2675,12 +2525,6 @@
         <w:gridCol w:w="3138"/>
       </w:tblGrid>
       <w:tr>
-        <w:tblPrEx>
-          <w:tblCellMar>
-            <w:top w:w="0" w:type="dxa"/>
-            <w:bottom w:w="0" w:type="dxa"/>
-          </w:tblCellMar>
-        </w:tblPrEx>
         <w:tc>
           <w:tcPr>
             <w:tcW w:w="3137" w:type="dxa"/>
@@ -2752,12 +2596,6 @@
         </w:tc>
       </w:tr>
       <w:tr>
-        <w:tblPrEx>
-          <w:tblCellMar>
-            <w:top w:w="0" w:type="dxa"/>
-            <w:bottom w:w="0" w:type="dxa"/>
-          </w:tblCellMar>
-        </w:tblPrEx>
         <w:tc>
           <w:tcPr>
             <w:tcW w:w="3137" w:type="dxa"/>
@@ -2823,12 +2661,6 @@
         </w:tc>
       </w:tr>
       <w:tr>
-        <w:tblPrEx>
-          <w:tblCellMar>
-            <w:top w:w="0" w:type="dxa"/>
-            <w:bottom w:w="0" w:type="dxa"/>
-          </w:tblCellMar>
-        </w:tblPrEx>
         <w:tc>
           <w:tcPr>
             <w:tcW w:w="3137" w:type="dxa"/>
@@ -2894,12 +2726,6 @@
         </w:tc>
       </w:tr>
       <w:tr>
-        <w:tblPrEx>
-          <w:tblCellMar>
-            <w:top w:w="0" w:type="dxa"/>
-            <w:bottom w:w="0" w:type="dxa"/>
-          </w:tblCellMar>
-        </w:tblPrEx>
         <w:tc>
           <w:tcPr>
             <w:tcW w:w="3137" w:type="dxa"/>
@@ -2965,12 +2791,6 @@
         </w:tc>
       </w:tr>
       <w:tr>
-        <w:tblPrEx>
-          <w:tblCellMar>
-            <w:top w:w="0" w:type="dxa"/>
-            <w:bottom w:w="0" w:type="dxa"/>
-          </w:tblCellMar>
-        </w:tblPrEx>
         <w:tc>
           <w:tcPr>
             <w:tcW w:w="3137" w:type="dxa"/>
@@ -3036,12 +2856,6 @@
         </w:tc>
       </w:tr>
       <w:tr>
-        <w:tblPrEx>
-          <w:tblCellMar>
-            <w:top w:w="0" w:type="dxa"/>
-            <w:bottom w:w="0" w:type="dxa"/>
-          </w:tblCellMar>
-        </w:tblPrEx>
         <w:tc>
           <w:tcPr>
             <w:tcW w:w="3137" w:type="dxa"/>
@@ -3107,12 +2921,6 @@
         </w:tc>
       </w:tr>
       <w:tr>
-        <w:tblPrEx>
-          <w:tblCellMar>
-            <w:top w:w="0" w:type="dxa"/>
-            <w:bottom w:w="0" w:type="dxa"/>
-          </w:tblCellMar>
-        </w:tblPrEx>
         <w:tc>
           <w:tcPr>
             <w:tcW w:w="3137" w:type="dxa"/>
@@ -3178,12 +2986,6 @@
         </w:tc>
       </w:tr>
       <w:tr>
-        <w:tblPrEx>
-          <w:tblCellMar>
-            <w:top w:w="0" w:type="dxa"/>
-            <w:bottom w:w="0" w:type="dxa"/>
-          </w:tblCellMar>
-        </w:tblPrEx>
         <w:tc>
           <w:tcPr>
             <w:tcW w:w="3137" w:type="dxa"/>
@@ -3249,12 +3051,6 @@
         </w:tc>
       </w:tr>
       <w:tr>
-        <w:tblPrEx>
-          <w:tblCellMar>
-            <w:top w:w="0" w:type="dxa"/>
-            <w:bottom w:w="0" w:type="dxa"/>
-          </w:tblCellMar>
-        </w:tblPrEx>
         <w:tc>
           <w:tcPr>
             <w:tcW w:w="3137" w:type="dxa"/>
@@ -3320,12 +3116,6 @@
         </w:tc>
       </w:tr>
       <w:tr>
-        <w:tblPrEx>
-          <w:tblCellMar>
-            <w:top w:w="0" w:type="dxa"/>
-            <w:bottom w:w="0" w:type="dxa"/>
-          </w:tblCellMar>
-        </w:tblPrEx>
         <w:tc>
           <w:tcPr>
             <w:tcW w:w="3137" w:type="dxa"/>
@@ -3391,12 +3181,6 @@
         </w:tc>
       </w:tr>
       <w:tr>
-        <w:tblPrEx>
-          <w:tblCellMar>
-            <w:top w:w="0" w:type="dxa"/>
-            <w:bottom w:w="0" w:type="dxa"/>
-          </w:tblCellMar>
-        </w:tblPrEx>
         <w:tc>
           <w:tcPr>
             <w:tcW w:w="3137" w:type="dxa"/>
@@ -3462,12 +3246,6 @@
         </w:tc>
       </w:tr>
       <w:tr>
-        <w:tblPrEx>
-          <w:tblCellMar>
-            <w:top w:w="0" w:type="dxa"/>
-            <w:bottom w:w="0" w:type="dxa"/>
-          </w:tblCellMar>
-        </w:tblPrEx>
         <w:tc>
           <w:tcPr>
             <w:tcW w:w="3137" w:type="dxa"/>
@@ -3533,12 +3311,6 @@
         </w:tc>
       </w:tr>
       <w:tr>
-        <w:tblPrEx>
-          <w:tblCellMar>
-            <w:top w:w="0" w:type="dxa"/>
-            <w:bottom w:w="0" w:type="dxa"/>
-          </w:tblCellMar>
-        </w:tblPrEx>
         <w:tc>
           <w:tcPr>
             <w:tcW w:w="3137" w:type="dxa"/>
@@ -3604,12 +3376,6 @@
         </w:tc>
       </w:tr>
       <w:tr>
-        <w:tblPrEx>
-          <w:tblCellMar>
-            <w:top w:w="0" w:type="dxa"/>
-            <w:bottom w:w="0" w:type="dxa"/>
-          </w:tblCellMar>
-        </w:tblPrEx>
         <w:tc>
           <w:tcPr>
             <w:tcW w:w="3137" w:type="dxa"/>
@@ -3675,12 +3441,6 @@
         </w:tc>
       </w:tr>
       <w:tr>
-        <w:tblPrEx>
-          <w:tblCellMar>
-            <w:top w:w="0" w:type="dxa"/>
-            <w:bottom w:w="0" w:type="dxa"/>
-          </w:tblCellMar>
-        </w:tblPrEx>
         <w:tc>
           <w:tcPr>
             <w:tcW w:w="3137" w:type="dxa"/>
@@ -3746,12 +3506,6 @@
         </w:tc>
       </w:tr>
       <w:tr>
-        <w:tblPrEx>
-          <w:tblCellMar>
-            <w:top w:w="0" w:type="dxa"/>
-            <w:bottom w:w="0" w:type="dxa"/>
-          </w:tblCellMar>
-        </w:tblPrEx>
         <w:tc>
           <w:tcPr>
             <w:tcW w:w="3137" w:type="dxa"/>
@@ -3817,12 +3571,6 @@
         </w:tc>
       </w:tr>
       <w:tr>
-        <w:tblPrEx>
-          <w:tblCellMar>
-            <w:top w:w="0" w:type="dxa"/>
-            <w:bottom w:w="0" w:type="dxa"/>
-          </w:tblCellMar>
-        </w:tblPrEx>
         <w:tc>
           <w:tcPr>
             <w:tcW w:w="3137" w:type="dxa"/>
@@ -3888,12 +3636,6 @@
         </w:tc>
       </w:tr>
       <w:tr>
-        <w:tblPrEx>
-          <w:tblCellMar>
-            <w:top w:w="0" w:type="dxa"/>
-            <w:bottom w:w="0" w:type="dxa"/>
-          </w:tblCellMar>
-        </w:tblPrEx>
         <w:tc>
           <w:tcPr>
             <w:tcW w:w="3137" w:type="dxa"/>
@@ -3959,12 +3701,6 @@
         </w:tc>
       </w:tr>
       <w:tr>
-        <w:tblPrEx>
-          <w:tblCellMar>
-            <w:top w:w="0" w:type="dxa"/>
-            <w:bottom w:w="0" w:type="dxa"/>
-          </w:tblCellMar>
-        </w:tblPrEx>
         <w:tc>
           <w:tcPr>
             <w:tcW w:w="3137" w:type="dxa"/>
@@ -4030,12 +3766,6 @@
         </w:tc>
       </w:tr>
       <w:tr>
-        <w:tblPrEx>
-          <w:tblCellMar>
-            <w:top w:w="0" w:type="dxa"/>
-            <w:bottom w:w="0" w:type="dxa"/>
-          </w:tblCellMar>
-        </w:tblPrEx>
         <w:tc>
           <w:tcPr>
             <w:tcW w:w="3137" w:type="dxa"/>
@@ -4101,12 +3831,6 @@
         </w:tc>
       </w:tr>
       <w:tr>
-        <w:tblPrEx>
-          <w:tblCellMar>
-            <w:top w:w="0" w:type="dxa"/>
-            <w:bottom w:w="0" w:type="dxa"/>
-          </w:tblCellMar>
-        </w:tblPrEx>
         <w:tc>
           <w:tcPr>
             <w:tcW w:w="3137" w:type="dxa"/>
@@ -4172,12 +3896,6 @@
         </w:tc>
       </w:tr>
       <w:tr>
-        <w:tblPrEx>
-          <w:tblCellMar>
-            <w:top w:w="0" w:type="dxa"/>
-            <w:bottom w:w="0" w:type="dxa"/>
-          </w:tblCellMar>
-        </w:tblPrEx>
         <w:tc>
           <w:tcPr>
             <w:tcW w:w="3137" w:type="dxa"/>
@@ -4243,12 +3961,6 @@
         </w:tc>
       </w:tr>
       <w:tr>
-        <w:tblPrEx>
-          <w:tblCellMar>
-            <w:top w:w="0" w:type="dxa"/>
-            <w:bottom w:w="0" w:type="dxa"/>
-          </w:tblCellMar>
-        </w:tblPrEx>
         <w:tc>
           <w:tcPr>
             <w:tcW w:w="3137" w:type="dxa"/>
@@ -4314,12 +4026,6 @@
         </w:tc>
       </w:tr>
       <w:tr>
-        <w:tblPrEx>
-          <w:tblCellMar>
-            <w:top w:w="0" w:type="dxa"/>
-            <w:bottom w:w="0" w:type="dxa"/>
-          </w:tblCellMar>
-        </w:tblPrEx>
         <w:tc>
           <w:tcPr>
             <w:tcW w:w="3137" w:type="dxa"/>
@@ -4385,12 +4091,6 @@
         </w:tc>
       </w:tr>
       <w:tr>
-        <w:tblPrEx>
-          <w:tblCellMar>
-            <w:top w:w="0" w:type="dxa"/>
-            <w:bottom w:w="0" w:type="dxa"/>
-          </w:tblCellMar>
-        </w:tblPrEx>
         <w:tc>
           <w:tcPr>
             <w:tcW w:w="3137" w:type="dxa"/>
@@ -4456,12 +4156,6 @@
         </w:tc>
       </w:tr>
       <w:tr>
-        <w:tblPrEx>
-          <w:tblCellMar>
-            <w:top w:w="0" w:type="dxa"/>
-            <w:bottom w:w="0" w:type="dxa"/>
-          </w:tblCellMar>
-        </w:tblPrEx>
         <w:tc>
           <w:tcPr>
             <w:tcW w:w="3137" w:type="dxa"/>
@@ -4678,124 +4372,32 @@
     </w:p>
     <w:p>
       <w:pPr>
-        <w:spacing w:after="0"/>
+        <w:spacing w:after="40"/>
+        <w:rPr>
+          <w:rFonts w:ascii="Aptos" w:hAnsi="Aptos"/>
+          <w:sz w:val="21"/>
+        </w:rPr>
+      </w:pPr>
+      <w:r>
         <w:rPr>
           <w:rFonts w:ascii="Aptos" w:hAnsi="Aptos"/>
           <w:sz w:val="18"/>
         </w:rPr>
-      </w:pPr>
+        <w:t>Yat</w:t>
+      </w:r>
       <w:r>
         <w:rPr>
           <w:rFonts w:ascii="Aptos" w:hAnsi="Aptos"/>
           <w:sz w:val="18"/>
         </w:rPr>
-        <w:t>Yatzy/</w:t>
-      </w:r>
-    </w:p>
-    <w:p>
-      <w:pPr>
-        <w:spacing w:after="0"/>
-        <w:rPr>
-          <w:rFonts w:ascii="Aptos" w:hAnsi="Aptos"/>
-          <w:sz w:val="18"/>
-        </w:rPr>
-      </w:pPr>
-      <w:r>
-        <w:rPr>
-          <w:rFonts w:ascii="Aptos" w:hAnsi="Aptos" w:cs="Arial"/>
-          <w:sz w:val="18"/>
-        </w:rPr>
-        <w:t>├</w:t>
-      </w:r>
-      <w:r>
-        <w:rPr>
-          <w:rFonts w:ascii="Aptos" w:hAnsi="Aptos" w:cs="Aptos"/>
-          <w:sz w:val="18"/>
-        </w:rPr>
-        <w:t>──</w:t>
-      </w:r>
-      <w:r>
-        <w:rPr>
-          <w:rFonts w:ascii="Aptos" w:hAnsi="Aptos"/>
-          <w:sz w:val="18"/>
-        </w:rPr>
-        <w:t xml:space="preserve"> src/Yatzy.Core/     spillogik uden WPF-afh</w:t>
-      </w:r>
-      <w:r>
-        <w:rPr>
-          <w:rFonts w:ascii="Aptos" w:hAnsi="Aptos" w:cs="Aptos"/>
-          <w:sz w:val="18"/>
-        </w:rPr>
-        <w:t>æ</w:t>
-      </w:r>
-      <w:r>
-        <w:rPr>
-          <w:rFonts w:ascii="Aptos" w:hAnsi="Aptos"/>
-          <w:sz w:val="18"/>
-        </w:rPr>
-        <w:t>ngighed</w:t>
-      </w:r>
-    </w:p>
-    <w:p>
-      <w:pPr>
-        <w:spacing w:after="0"/>
-        <w:rPr>
-          <w:rFonts w:ascii="Aptos" w:hAnsi="Aptos"/>
-          <w:sz w:val="18"/>
-        </w:rPr>
-      </w:pPr>
-      <w:r>
-        <w:rPr>
-          <w:rFonts w:ascii="Aptos" w:hAnsi="Aptos" w:cs="Arial"/>
-          <w:sz w:val="18"/>
-        </w:rPr>
-        <w:t>├</w:t>
-      </w:r>
-      <w:r>
-        <w:rPr>
-          <w:rFonts w:ascii="Aptos" w:hAnsi="Aptos" w:cs="Aptos"/>
-          <w:sz w:val="18"/>
-        </w:rPr>
-        <w:t>──</w:t>
-      </w:r>
-      <w:r>
-        <w:rPr>
-          <w:rFonts w:ascii="Aptos" w:hAnsi="Aptos"/>
-          <w:sz w:val="18"/>
-        </w:rPr>
-        <w:t xml:space="preserve"> src/Yatzy.App/      WPF-brugerflade</w:t>
-      </w:r>
-    </w:p>
-    <w:p>
-      <w:pPr>
-        <w:spacing w:after="0"/>
-        <w:rPr>
-          <w:rFonts w:ascii="Aptos" w:hAnsi="Aptos"/>
-          <w:sz w:val="18"/>
-        </w:rPr>
-      </w:pPr>
-      <w:r>
-        <w:rPr>
-          <w:rFonts w:ascii="Aptos" w:hAnsi="Aptos"/>
-          <w:sz w:val="18"/>
-        </w:rPr>
-        <w:t>└── tests/Yatzy.Tests/  xUnit-tests</w:t>
-      </w:r>
-    </w:p>
-    <w:p>
-      <w:pPr>
-        <w:spacing w:after="40"/>
-        <w:rPr>
-          <w:rFonts w:ascii="Aptos" w:hAnsi="Aptos"/>
-          <w:sz w:val="21"/>
-        </w:rPr>
-      </w:pPr>
-      <w:r>
-        <w:rPr>
-          <w:rFonts w:ascii="Aptos" w:hAnsi="Aptos"/>
-          <w:sz w:val="21"/>
-        </w:rPr>
-        <w:t>1. Opret solution og projekter samt `.gitignore`; byg løsningen.</w:t>
+        <w:t>Brugerfladen gennemgås manuelt for navnevalidering, dansk tekst, responsivt layout, animation, lydindstilling, dialoger og visning af computerens tur. Det kontrolleres også, at “Nyt spil” spørger under et igangværende spil, men åbner startvinduet direkte efter et afsluttet spil.</w:t>
+      </w:r>
+      <w:r>
+        <w:rPr>
+          <w:rFonts w:ascii="Aptos" w:hAnsi="Aptos"/>
+          <w:sz w:val="21"/>
+        </w:rPr>
+        <w:t>on og projekter samt `.gitignore`; byg løsningen.</w:t>
       </w:r>
     </w:p>
     <w:p>
@@ -5015,12 +4617,6 @@
         <w:gridCol w:w="4706"/>
       </w:tblGrid>
       <w:tr>
-        <w:tblPrEx>
-          <w:tblCellMar>
-            <w:top w:w="0" w:type="dxa"/>
-            <w:bottom w:w="0" w:type="dxa"/>
-          </w:tblCellMar>
-        </w:tblPrEx>
         <w:tc>
           <w:tcPr>
             <w:tcW w:w="4706" w:type="dxa"/>
@@ -5069,12 +4665,6 @@
         </w:tc>
       </w:tr>
       <w:tr>
-        <w:tblPrEx>
-          <w:tblCellMar>
-            <w:top w:w="0" w:type="dxa"/>
-            <w:bottom w:w="0" w:type="dxa"/>
-          </w:tblCellMar>
-        </w:tblPrEx>
         <w:tc>
           <w:tcPr>
             <w:tcW w:w="4706" w:type="dxa"/>
@@ -5119,12 +4709,6 @@
         </w:tc>
       </w:tr>
       <w:tr>
-        <w:tblPrEx>
-          <w:tblCellMar>
-            <w:top w:w="0" w:type="dxa"/>
-            <w:bottom w:w="0" w:type="dxa"/>
-          </w:tblCellMar>
-        </w:tblPrEx>
         <w:tc>
           <w:tcPr>
             <w:tcW w:w="4706" w:type="dxa"/>
@@ -5169,12 +4753,6 @@
         </w:tc>
       </w:tr>
       <w:tr>
-        <w:tblPrEx>
-          <w:tblCellMar>
-            <w:top w:w="0" w:type="dxa"/>
-            <w:bottom w:w="0" w:type="dxa"/>
-          </w:tblCellMar>
-        </w:tblPrEx>
         <w:tc>
           <w:tcPr>
             <w:tcW w:w="4706" w:type="dxa"/>
@@ -5219,12 +4797,6 @@
         </w:tc>
       </w:tr>
       <w:tr>
-        <w:tblPrEx>
-          <w:tblCellMar>
-            <w:top w:w="0" w:type="dxa"/>
-            <w:bottom w:w="0" w:type="dxa"/>
-          </w:tblCellMar>
-        </w:tblPrEx>
         <w:tc>
           <w:tcPr>
             <w:tcW w:w="4706" w:type="dxa"/>
@@ -5269,12 +4841,6 @@
         </w:tc>
       </w:tr>
       <w:tr>
-        <w:tblPrEx>
-          <w:tblCellMar>
-            <w:top w:w="0" w:type="dxa"/>
-            <w:bottom w:w="0" w:type="dxa"/>
-          </w:tblCellMar>
-        </w:tblPrEx>
         <w:tc>
           <w:tcPr>
             <w:tcW w:w="4706" w:type="dxa"/>
@@ -5319,12 +4885,6 @@
         </w:tc>
       </w:tr>
       <w:tr>
-        <w:tblPrEx>
-          <w:tblCellMar>
-            <w:top w:w="0" w:type="dxa"/>
-            <w:bottom w:w="0" w:type="dxa"/>
-          </w:tblCellMar>
-        </w:tblPrEx>
         <w:tc>
           <w:tcPr>
             <w:tcW w:w="4706" w:type="dxa"/>

</xml_diff>

<commit_message>
Præciser pointoversigt og computerstrategi
</commit_message>
<xml_diff>
--- a/Yatzy-SDD.docx
+++ b/Yatzy-SDD.docx
@@ -1918,7 +1918,30 @@
           <w:rFonts w:ascii="Aptos" w:hAnsi="Aptos"/>
           <w:sz w:val="21"/>
         </w:rPr>
-        <w:t>• Bonus vises som 50 straks ved mindst 63 i øvre sektion; når den øvre sektion er færdig uden 63 point, vises 0.</w:t>
+        <w:t xml:space="preserve">• Bonus vises som 50 straks ved mindst 63 i øvre sektion; når </w:t>
+      </w:r>
+    </w:p>
+    <w:p>
+      <w:pPr>
+        <w:spacing w:after="40"/>
+        <w:rPr>
+          <w:rFonts w:ascii="Aptos" w:hAnsi="Aptos"/>
+          <w:sz w:val="21"/>
+        </w:rPr>
+      </w:pPr>
+      <w:r>
+        <w:rPr>
+          <w:rFonts w:ascii="Aptos" w:hAnsi="Aptos"/>
+          <w:sz w:val="21"/>
+        </w:rPr>
+        <w:t>Hver spillerkolonne viser øvre subtotal, bonus, øvre total, nedre subtotal og samlet score. Den samlede score er øvre total plus nedre subtotal.</w:t>
+      </w:r>
+      <w:r>
+        <w:rPr>
+          <w:rFonts w:ascii="Aptos" w:hAnsi="Aptos"/>
+          <w:sz w:val="21"/>
+        </w:rPr>
+        <w:t>den øvre sektion er færdig uden 63 point, vises 0.</w:t>
       </w:r>
     </w:p>
     <w:p>
@@ -2075,7 +2098,7 @@
           <w:rFonts w:ascii="Aptos" w:hAnsi="Aptos"/>
           <w:sz w:val="21"/>
         </w:rPr>
-        <w:t>Computeren må observere de menneskelige medspilleres afsluttede ture på samme måde som en menneskelig modspiller kan. Den registrerer derfor, hvilke terninger de holder, og hvilke kategorier de vælger. Disse observationer samles på tværs af alle menneskelige spillere og bruges kun som fælles mønstre til at justere computerens prioritering mellem ellers lige gode, lovlige valg. Computeren opretter ikke personprofiler og forsøger ikke at lære bestemte spillere at kende. Læringen gemmes lokalt mellem spil på den samme computer, men bruger ingen eksterne data eller tjenester.</w:t>
+        <w:t>Computeren må observere de menneskelige medspilleres afslutted</w:t>
       </w:r>
     </w:p>
     <w:p>
@@ -2091,6 +2114,30 @@
           <w:rFonts w:ascii="Aptos" w:hAnsi="Aptos"/>
           <w:sz w:val="21"/>
         </w:rPr>
+        <w:t>Computerens basisstrategi er bevidst enkel og menneskelignende: Den vurderer kun de synlige terninger, antal kast tilbage og sine ledige kategorier. Før et nyt kast prioriterer den at holde eksisterende grupper af ens terninger, forskellige terninger som bygger mod en straight og høje terninger, der kan bruges i den øvre sektion. Den kan afslutte tidligt ved særligt stærke, færdige kombinationer som Yatzy, straight, fuldt hus eller fire ens. Når flere lovlige valg er lige gode efter denne vurdering, bruges de fælles læringsmønstre kun som afgørelse mellem dem.</w:t>
+      </w:r>
+      <w:r>
+        <w:rPr>
+          <w:rFonts w:ascii="Aptos" w:hAnsi="Aptos"/>
+          <w:sz w:val="21"/>
+        </w:rPr>
+        <w:t>e ture på samme måde som en menneskelig modspiller kan. Den registrerer derfor, hvilke terninger de holder, og hvilke kategorier de vælger. Disse observationer samles på tværs af alle menneskelige spillere og bruges kun som fælles mønstre til at justere computerens prioritering mellem ellers lige gode, lovlige valg. Computeren opretter ikke personprofiler og forsøger ikke at lære bestemte spillere at kende. Læringen gemmes lokalt mellem spil på den samme computer, men bruger ingen eksterne data eller tjenester.</w:t>
+      </w:r>
+    </w:p>
+    <w:p>
+      <w:pPr>
+        <w:spacing w:after="100"/>
+        <w:rPr>
+          <w:rFonts w:ascii="Aptos" w:hAnsi="Aptos"/>
+          <w:sz w:val="21"/>
+        </w:rPr>
+      </w:pPr>
+      <w:r>
+        <w:rPr>
+          <w:rFonts w:ascii="Aptos" w:hAnsi="Aptos"/>
+          <w:sz w:val="21"/>
+        </w:rPr>
+        <w:lastRenderedPageBreak/>
         <w:t>Brugeren kan fra start- eller hovedvinduet vælge “Nulstil computerens læring”. Handlingen sletter kun de gemte spillestilsmønstre og kræver en bekræftelse.</w:t>
       </w:r>
     </w:p>

</xml_diff>